<commit_message>
docs: embute prints da execucao (WSL) no trabalho escrito
- evidencias/img: prints de terminal (gerados das saidas reais) + screenshots do app e do GitHub Actions
- scripts/gerar-prints.py
- trabalho-escrito.docx regenerado com as 10 figuras na secao 9

Co-Authored-By: Claude Opus 4.8 <noreply@anthropic.com>
</commit_message>
<xml_diff>
--- a/docs/trabalho-escrito.docx
+++ b/docs/trabalho-escrito.docx
@@ -3568,7 +3568,7 @@
     </w:p>
     <w:bookmarkEnd w:id="19"/>
     <w:bookmarkEnd w:id="20"/>
-    <w:bookmarkStart w:id="21" w:name="resultados-e-evidências"/>
+    <w:bookmarkStart w:id="52" w:name="resultados-e-evidências"/>
     <w:p>
       <w:pPr>
         <w:pStyle w:val="Heading1"/>
@@ -4096,135 +4096,870 @@
         <w:t xml:space="preserve">— respostas da aplicação funcionando.</w:t>
       </w:r>
     </w:p>
+    <w:bookmarkStart w:id="51" w:name="prints-da-execução-wsl"/>
+    <w:p>
+      <w:pPr>
+        <w:pStyle w:val="Heading2"/>
+      </w:pPr>
+      <w:r>
+        <w:t xml:space="preserve">9.1 Prints da execução (WSL)</w:t>
+      </w:r>
+    </w:p>
+    <w:p>
+      <w:pPr>
+        <w:pStyle w:val="FirstParagraph"/>
+      </w:pPr>
+      <w:r>
+        <w:t xml:space="preserve">As figuras a seguir são as capturas da execução real da esteira no ambiente</w:t>
+      </w:r>
+      <w:r>
+        <w:t xml:space="preserve"> </w:t>
+      </w:r>
+      <w:r>
+        <w:t xml:space="preserve">WSL2 + Docker, cobrindo cada etapa exigida (build, teste, security scan, imagem</w:t>
+      </w:r>
+      <w:r>
+        <w:t xml:space="preserve"> </w:t>
+      </w:r>
+      <w:r>
+        <w:t xml:space="preserve">Docker, container e aplicação funcionando), além da pipeline no GitHub Actions.</w:t>
+      </w:r>
+    </w:p>
+    <w:p>
+      <w:pPr>
+        <w:pStyle w:val="CaptionedFigure"/>
+      </w:pPr>
+      <w:r>
+        <w:drawing>
+          <wp:inline>
+            <wp:extent cx="5334000" cy="3112057"/>
+            <wp:effectExtent b="0" l="0" r="0" t="0"/>
+            <wp:docPr descr="Figura 1 — Testes automatizados (pytest): 6 testes aprovados." title="" id="22" name="Picture"/>
+            <a:graphic>
+              <a:graphicData uri="http://schemas.openxmlformats.org/drawingml/2006/picture">
+                <pic:pic>
+                  <pic:nvPicPr>
+                    <pic:cNvPr descr="evidencias/img/fig-01-testes.png" id="23" name="Picture"/>
+                    <pic:cNvPicPr>
+                      <a:picLocks noChangeArrowheads="1" noChangeAspect="1"/>
+                    </pic:cNvPicPr>
+                  </pic:nvPicPr>
+                  <pic:blipFill>
+                    <a:blip r:embed="rId21"/>
+                    <a:stretch>
+                      <a:fillRect/>
+                    </a:stretch>
+                  </pic:blipFill>
+                  <pic:spPr bwMode="auto">
+                    <a:xfrm>
+                      <a:off x="0" y="0"/>
+                      <a:ext cx="5334000" cy="3112057"/>
+                    </a:xfrm>
+                    <a:prstGeom prst="rect">
+                      <a:avLst/>
+                    </a:prstGeom>
+                    <a:noFill/>
+                    <a:ln w="9525">
+                      <a:noFill/>
+                      <a:headEnd/>
+                      <a:tailEnd/>
+                    </a:ln>
+                  </pic:spPr>
+                </pic:pic>
+              </a:graphicData>
+            </a:graphic>
+          </wp:inline>
+        </w:drawing>
+      </w:r>
+    </w:p>
+    <w:p>
+      <w:pPr>
+        <w:pStyle w:val="ImageCaption"/>
+      </w:pPr>
+      <w:r>
+        <w:t xml:space="preserve">Figura 1 — Testes automatizados (pytest): 6 testes aprovados.</w:t>
+      </w:r>
+    </w:p>
+    <w:p>
+      <w:pPr>
+        <w:pStyle w:val="CaptionedFigure"/>
+      </w:pPr>
+      <w:r>
+        <w:drawing>
+          <wp:inline>
+            <wp:extent cx="5334000" cy="4223703"/>
+            <wp:effectExtent b="0" l="0" r="0" t="0"/>
+            <wp:docPr descr="Figura 2 — Security scan com Bandit (SAST): achado B104 no código." title="" id="25" name="Picture"/>
+            <a:graphic>
+              <a:graphicData uri="http://schemas.openxmlformats.org/drawingml/2006/picture">
+                <pic:pic>
+                  <pic:nvPicPr>
+                    <pic:cNvPr descr="evidencias/img/fig-02-bandit.png" id="26" name="Picture"/>
+                    <pic:cNvPicPr>
+                      <a:picLocks noChangeArrowheads="1" noChangeAspect="1"/>
+                    </pic:cNvPicPr>
+                  </pic:nvPicPr>
+                  <pic:blipFill>
+                    <a:blip r:embed="rId24"/>
+                    <a:stretch>
+                      <a:fillRect/>
+                    </a:stretch>
+                  </pic:blipFill>
+                  <pic:spPr bwMode="auto">
+                    <a:xfrm>
+                      <a:off x="0" y="0"/>
+                      <a:ext cx="5334000" cy="4223703"/>
+                    </a:xfrm>
+                    <a:prstGeom prst="rect">
+                      <a:avLst/>
+                    </a:prstGeom>
+                    <a:noFill/>
+                    <a:ln w="9525">
+                      <a:noFill/>
+                      <a:headEnd/>
+                      <a:tailEnd/>
+                    </a:ln>
+                  </pic:spPr>
+                </pic:pic>
+              </a:graphicData>
+            </a:graphic>
+          </wp:inline>
+        </w:drawing>
+      </w:r>
+    </w:p>
+    <w:p>
+      <w:pPr>
+        <w:pStyle w:val="ImageCaption"/>
+      </w:pPr>
+      <w:r>
+        <w:t xml:space="preserve">Figura 2 — Security scan com Bandit (SAST): achado B104 no código.</w:t>
+      </w:r>
+    </w:p>
+    <w:p>
+      <w:pPr>
+        <w:pStyle w:val="CaptionedFigure"/>
+      </w:pPr>
+      <w:r>
+        <w:drawing>
+          <wp:inline>
+            <wp:extent cx="5334000" cy="6777317"/>
+            <wp:effectExtent b="0" l="0" r="0" t="0"/>
+            <wp:docPr descr="Figura 3 — Security scan com pip-audit: CVEs nas dependências." title="" id="28" name="Picture"/>
+            <a:graphic>
+              <a:graphicData uri="http://schemas.openxmlformats.org/drawingml/2006/picture">
+                <pic:pic>
+                  <pic:nvPicPr>
+                    <pic:cNvPr descr="evidencias/img/fig-03-pip-audit.png" id="29" name="Picture"/>
+                    <pic:cNvPicPr>
+                      <a:picLocks noChangeArrowheads="1" noChangeAspect="1"/>
+                    </pic:cNvPicPr>
+                  </pic:nvPicPr>
+                  <pic:blipFill>
+                    <a:blip r:embed="rId27"/>
+                    <a:stretch>
+                      <a:fillRect/>
+                    </a:stretch>
+                  </pic:blipFill>
+                  <pic:spPr bwMode="auto">
+                    <a:xfrm>
+                      <a:off x="0" y="0"/>
+                      <a:ext cx="5334000" cy="6777317"/>
+                    </a:xfrm>
+                    <a:prstGeom prst="rect">
+                      <a:avLst/>
+                    </a:prstGeom>
+                    <a:noFill/>
+                    <a:ln w="9525">
+                      <a:noFill/>
+                      <a:headEnd/>
+                      <a:tailEnd/>
+                    </a:ln>
+                  </pic:spPr>
+                </pic:pic>
+              </a:graphicData>
+            </a:graphic>
+          </wp:inline>
+        </w:drawing>
+      </w:r>
+    </w:p>
+    <w:p>
+      <w:pPr>
+        <w:pStyle w:val="ImageCaption"/>
+      </w:pPr>
+      <w:r>
+        <w:t xml:space="preserve">Figura 3 — Security scan com pip-audit: CVEs nas dependências.</w:t>
+      </w:r>
+    </w:p>
+    <w:p>
+      <w:pPr>
+        <w:pStyle w:val="CaptionedFigure"/>
+      </w:pPr>
+      <w:r>
+        <w:drawing>
+          <wp:inline>
+            <wp:extent cx="5334000" cy="3649164"/>
+            <wp:effectExtent b="0" l="0" r="0" t="0"/>
+            <wp:docPr descr="Figura 4 — Security scan com Trivy (filesystem): 8 vulnerabilidades HIGH." title="" id="31" name="Picture"/>
+            <a:graphic>
+              <a:graphicData uri="http://schemas.openxmlformats.org/drawingml/2006/picture">
+                <pic:pic>
+                  <pic:nvPicPr>
+                    <pic:cNvPr descr="evidencias/img/fig-04-trivy-fs.png" id="32" name="Picture"/>
+                    <pic:cNvPicPr>
+                      <a:picLocks noChangeArrowheads="1" noChangeAspect="1"/>
+                    </pic:cNvPicPr>
+                  </pic:nvPicPr>
+                  <pic:blipFill>
+                    <a:blip r:embed="rId30"/>
+                    <a:stretch>
+                      <a:fillRect/>
+                    </a:stretch>
+                  </pic:blipFill>
+                  <pic:spPr bwMode="auto">
+                    <a:xfrm>
+                      <a:off x="0" y="0"/>
+                      <a:ext cx="5334000" cy="3649164"/>
+                    </a:xfrm>
+                    <a:prstGeom prst="rect">
+                      <a:avLst/>
+                    </a:prstGeom>
+                    <a:noFill/>
+                    <a:ln w="9525">
+                      <a:noFill/>
+                      <a:headEnd/>
+                      <a:tailEnd/>
+                    </a:ln>
+                  </pic:spPr>
+                </pic:pic>
+              </a:graphicData>
+            </a:graphic>
+          </wp:inline>
+        </w:drawing>
+      </w:r>
+    </w:p>
+    <w:p>
+      <w:pPr>
+        <w:pStyle w:val="ImageCaption"/>
+      </w:pPr>
+      <w:r>
+        <w:t xml:space="preserve">Figura 4 — Security scan com Trivy (filesystem): 8 vulnerabilidades HIGH.</w:t>
+      </w:r>
+    </w:p>
+    <w:p>
+      <w:pPr>
+        <w:pStyle w:val="CaptionedFigure"/>
+      </w:pPr>
+      <w:r>
+        <w:drawing>
+          <wp:inline>
+            <wp:extent cx="5334000" cy="2690601"/>
+            <wp:effectExtent b="0" l="0" r="0" t="0"/>
+            <wp:docPr descr="Figura 5 — Build da imagem Docker da aplicação." title="" id="34" name="Picture"/>
+            <a:graphic>
+              <a:graphicData uri="http://schemas.openxmlformats.org/drawingml/2006/picture">
+                <pic:pic>
+                  <pic:nvPicPr>
+                    <pic:cNvPr descr="evidencias/img/fig-05-docker-build.png" id="35" name="Picture"/>
+                    <pic:cNvPicPr>
+                      <a:picLocks noChangeArrowheads="1" noChangeAspect="1"/>
+                    </pic:cNvPicPr>
+                  </pic:nvPicPr>
+                  <pic:blipFill>
+                    <a:blip r:embed="rId33"/>
+                    <a:stretch>
+                      <a:fillRect/>
+                    </a:stretch>
+                  </pic:blipFill>
+                  <pic:spPr bwMode="auto">
+                    <a:xfrm>
+                      <a:off x="0" y="0"/>
+                      <a:ext cx="5334000" cy="2690601"/>
+                    </a:xfrm>
+                    <a:prstGeom prst="rect">
+                      <a:avLst/>
+                    </a:prstGeom>
+                    <a:noFill/>
+                    <a:ln w="9525">
+                      <a:noFill/>
+                      <a:headEnd/>
+                      <a:tailEnd/>
+                    </a:ln>
+                  </pic:spPr>
+                </pic:pic>
+              </a:graphicData>
+            </a:graphic>
+          </wp:inline>
+        </w:drawing>
+      </w:r>
+    </w:p>
+    <w:p>
+      <w:pPr>
+        <w:pStyle w:val="ImageCaption"/>
+      </w:pPr>
+      <w:r>
+        <w:t xml:space="preserve">Figura 5 — Build da imagem Docker da aplicação.</w:t>
+      </w:r>
+    </w:p>
+    <w:p>
+      <w:pPr>
+        <w:pStyle w:val="CaptionedFigure"/>
+      </w:pPr>
+      <w:r>
+        <w:drawing>
+          <wp:inline>
+            <wp:extent cx="5334000" cy="3010506"/>
+            <wp:effectExtent b="0" l="0" r="0" t="0"/>
+            <wp:docPr descr="Figura 6 — Scan da imagem Docker com Trivy (pacotes Python + SO)." title="" id="37" name="Picture"/>
+            <a:graphic>
+              <a:graphicData uri="http://schemas.openxmlformats.org/drawingml/2006/picture">
+                <pic:pic>
+                  <pic:nvPicPr>
+                    <pic:cNvPr descr="evidencias/img/fig-06-trivy-image.png" id="38" name="Picture"/>
+                    <pic:cNvPicPr>
+                      <a:picLocks noChangeArrowheads="1" noChangeAspect="1"/>
+                    </pic:cNvPicPr>
+                  </pic:nvPicPr>
+                  <pic:blipFill>
+                    <a:blip r:embed="rId36"/>
+                    <a:stretch>
+                      <a:fillRect/>
+                    </a:stretch>
+                  </pic:blipFill>
+                  <pic:spPr bwMode="auto">
+                    <a:xfrm>
+                      <a:off x="0" y="0"/>
+                      <a:ext cx="5334000" cy="3010506"/>
+                    </a:xfrm>
+                    <a:prstGeom prst="rect">
+                      <a:avLst/>
+                    </a:prstGeom>
+                    <a:noFill/>
+                    <a:ln w="9525">
+                      <a:noFill/>
+                      <a:headEnd/>
+                      <a:tailEnd/>
+                    </a:ln>
+                  </pic:spPr>
+                </pic:pic>
+              </a:graphicData>
+            </a:graphic>
+          </wp:inline>
+        </w:drawing>
+      </w:r>
+    </w:p>
+    <w:p>
+      <w:pPr>
+        <w:pStyle w:val="ImageCaption"/>
+      </w:pPr>
+      <w:r>
+        <w:t xml:space="preserve">Figura 6 — Scan da imagem Docker com Trivy (pacotes Python + SO).</w:t>
+      </w:r>
+    </w:p>
+    <w:p>
+      <w:pPr>
+        <w:pStyle w:val="CaptionedFigure"/>
+      </w:pPr>
+      <w:r>
+        <w:drawing>
+          <wp:inline>
+            <wp:extent cx="5334000" cy="950237"/>
+            <wp:effectExtent b="0" l="0" r="0" t="0"/>
+            <wp:docPr descr="Figura 7 — Container em execução (status healthy) na porta 8080." title="" id="40" name="Picture"/>
+            <a:graphic>
+              <a:graphicData uri="http://schemas.openxmlformats.org/drawingml/2006/picture">
+                <pic:pic>
+                  <pic:nvPicPr>
+                    <pic:cNvPr descr="evidencias/img/fig-07-container.png" id="41" name="Picture"/>
+                    <pic:cNvPicPr>
+                      <a:picLocks noChangeArrowheads="1" noChangeAspect="1"/>
+                    </pic:cNvPicPr>
+                  </pic:nvPicPr>
+                  <pic:blipFill>
+                    <a:blip r:embed="rId39"/>
+                    <a:stretch>
+                      <a:fillRect/>
+                    </a:stretch>
+                  </pic:blipFill>
+                  <pic:spPr bwMode="auto">
+                    <a:xfrm>
+                      <a:off x="0" y="0"/>
+                      <a:ext cx="5334000" cy="950237"/>
+                    </a:xfrm>
+                    <a:prstGeom prst="rect">
+                      <a:avLst/>
+                    </a:prstGeom>
+                    <a:noFill/>
+                    <a:ln w="9525">
+                      <a:noFill/>
+                      <a:headEnd/>
+                      <a:tailEnd/>
+                    </a:ln>
+                  </pic:spPr>
+                </pic:pic>
+              </a:graphicData>
+            </a:graphic>
+          </wp:inline>
+        </w:drawing>
+      </w:r>
+    </w:p>
+    <w:p>
+      <w:pPr>
+        <w:pStyle w:val="ImageCaption"/>
+      </w:pPr>
+      <w:r>
+        <w:t xml:space="preserve">Figura 7 — Container em execução (status</w:t>
+      </w:r>
+      <w:r>
+        <w:t xml:space="preserve"> </w:t>
+      </w:r>
+      <w:r>
+        <w:rPr>
+          <w:i/>
+          <w:iCs/>
+        </w:rPr>
+        <w:t xml:space="preserve">healthy</w:t>
+      </w:r>
+      <w:r>
+        <w:t xml:space="preserve">) na porta 8080.</w:t>
+      </w:r>
+    </w:p>
+    <w:p>
+      <w:pPr>
+        <w:pStyle w:val="CaptionedFigure"/>
+      </w:pPr>
+      <w:r>
+        <w:drawing>
+          <wp:inline>
+            <wp:extent cx="5334000" cy="2164976"/>
+            <wp:effectExtent b="0" l="0" r="0" t="0"/>
+            <wp:docPr descr="Figura 8 — Aplicação respondendo aos endpoints (curl)." title="" id="43" name="Picture"/>
+            <a:graphic>
+              <a:graphicData uri="http://schemas.openxmlformats.org/drawingml/2006/picture">
+                <pic:pic>
+                  <pic:nvPicPr>
+                    <pic:cNvPr descr="evidencias/img/fig-08-app-endpoints.png" id="44" name="Picture"/>
+                    <pic:cNvPicPr>
+                      <a:picLocks noChangeArrowheads="1" noChangeAspect="1"/>
+                    </pic:cNvPicPr>
+                  </pic:nvPicPr>
+                  <pic:blipFill>
+                    <a:blip r:embed="rId42"/>
+                    <a:stretch>
+                      <a:fillRect/>
+                    </a:stretch>
+                  </pic:blipFill>
+                  <pic:spPr bwMode="auto">
+                    <a:xfrm>
+                      <a:off x="0" y="0"/>
+                      <a:ext cx="5334000" cy="2164976"/>
+                    </a:xfrm>
+                    <a:prstGeom prst="rect">
+                      <a:avLst/>
+                    </a:prstGeom>
+                    <a:noFill/>
+                    <a:ln w="9525">
+                      <a:noFill/>
+                      <a:headEnd/>
+                      <a:tailEnd/>
+                    </a:ln>
+                  </pic:spPr>
+                </pic:pic>
+              </a:graphicData>
+            </a:graphic>
+          </wp:inline>
+        </w:drawing>
+      </w:r>
+    </w:p>
+    <w:p>
+      <w:pPr>
+        <w:pStyle w:val="ImageCaption"/>
+      </w:pPr>
+      <w:r>
+        <w:t xml:space="preserve">Figura 8 — Aplicação respondendo aos endpoints (curl).</w:t>
+      </w:r>
+    </w:p>
+    <w:p>
+      <w:pPr>
+        <w:pStyle w:val="CaptionedFigure"/>
+      </w:pPr>
+      <w:r>
+        <w:drawing>
+          <wp:inline>
+            <wp:extent cx="5334000" cy="3583781"/>
+            <wp:effectExtent b="0" l="0" r="0" t="0"/>
+            <wp:docPr descr="Figura 9 — Aplicação funcionando no navegador (http://localhost:8080)." title="" id="46" name="Picture"/>
+            <a:graphic>
+              <a:graphicData uri="http://schemas.openxmlformats.org/drawingml/2006/picture">
+                <pic:pic>
+                  <pic:nvPicPr>
+                    <pic:cNvPr descr="evidencias/img/fig-09-app-navegador.png" id="47" name="Picture"/>
+                    <pic:cNvPicPr>
+                      <a:picLocks noChangeArrowheads="1" noChangeAspect="1"/>
+                    </pic:cNvPicPr>
+                  </pic:nvPicPr>
+                  <pic:blipFill>
+                    <a:blip r:embed="rId45"/>
+                    <a:stretch>
+                      <a:fillRect/>
+                    </a:stretch>
+                  </pic:blipFill>
+                  <pic:spPr bwMode="auto">
+                    <a:xfrm>
+                      <a:off x="0" y="0"/>
+                      <a:ext cx="5334000" cy="3583781"/>
+                    </a:xfrm>
+                    <a:prstGeom prst="rect">
+                      <a:avLst/>
+                    </a:prstGeom>
+                    <a:noFill/>
+                    <a:ln w="9525">
+                      <a:noFill/>
+                      <a:headEnd/>
+                      <a:tailEnd/>
+                    </a:ln>
+                  </pic:spPr>
+                </pic:pic>
+              </a:graphicData>
+            </a:graphic>
+          </wp:inline>
+        </w:drawing>
+      </w:r>
+    </w:p>
+    <w:p>
+      <w:pPr>
+        <w:pStyle w:val="ImageCaption"/>
+      </w:pPr>
+      <w:r>
+        <w:t xml:space="preserve">Figura 9 — Aplicação funcionando no navegador (http://localhost:8080).</w:t>
+      </w:r>
+    </w:p>
+    <w:p>
+      <w:pPr>
+        <w:pStyle w:val="CaptionedFigure"/>
+      </w:pPr>
+      <w:r>
+        <w:drawing>
+          <wp:inline>
+            <wp:extent cx="5334000" cy="4685797"/>
+            <wp:effectExtent b="0" l="0" r="0" t="0"/>
+            <wp:docPr descr="Figura 10 — Pipeline no GitHub Actions disparada automaticamente a cada push." title="" id="49" name="Picture"/>
+            <a:graphic>
+              <a:graphicData uri="http://schemas.openxmlformats.org/drawingml/2006/picture">
+                <pic:pic>
+                  <pic:nvPicPr>
+                    <pic:cNvPr descr="evidencias/img/fig-10-actions.png" id="50" name="Picture"/>
+                    <pic:cNvPicPr>
+                      <a:picLocks noChangeArrowheads="1" noChangeAspect="1"/>
+                    </pic:cNvPicPr>
+                  </pic:nvPicPr>
+                  <pic:blipFill>
+                    <a:blip r:embed="rId48"/>
+                    <a:stretch>
+                      <a:fillRect/>
+                    </a:stretch>
+                  </pic:blipFill>
+                  <pic:spPr bwMode="auto">
+                    <a:xfrm>
+                      <a:off x="0" y="0"/>
+                      <a:ext cx="5334000" cy="4685797"/>
+                    </a:xfrm>
+                    <a:prstGeom prst="rect">
+                      <a:avLst/>
+                    </a:prstGeom>
+                    <a:noFill/>
+                    <a:ln w="9525">
+                      <a:noFill/>
+                      <a:headEnd/>
+                      <a:tailEnd/>
+                    </a:ln>
+                  </pic:spPr>
+                </pic:pic>
+              </a:graphicData>
+            </a:graphic>
+          </wp:inline>
+        </w:drawing>
+      </w:r>
+    </w:p>
+    <w:p>
+      <w:pPr>
+        <w:pStyle w:val="ImageCaption"/>
+      </w:pPr>
+      <w:r>
+        <w:t xml:space="preserve">Figura 10 — Pipeline no GitHub Actions disparada automaticamente a cada push.</w:t>
+      </w:r>
+    </w:p>
     <w:p>
       <w:pPr>
         <w:pStyle w:val="BlockText"/>
       </w:pPr>
+      <w:r>
+        <w:t xml:space="preserve">Observação: as capturas de terminal foram geradas a partir das saídas reais</w:t>
+      </w:r>
+      <w:r>
+        <w:t xml:space="preserve"> </w:t>
+      </w:r>
+      <w:r>
+        <w:t xml:space="preserve">salvas em</w:t>
+      </w:r>
+      <w:r>
+        <w:t xml:space="preserve"> </w:t>
+      </w:r>
+      <w:r>
+        <w:rPr>
+          <w:rStyle w:val="VerbatimChar"/>
+        </w:rPr>
+        <w:t xml:space="preserve">evidencias/</w:t>
+      </w:r>
+      <w:r>
+        <w:t xml:space="preserve"> </w:t>
+      </w:r>
+      <w:r>
+        <w:t xml:space="preserve">(arquivos</w:t>
+      </w:r>
+      <w:r>
+        <w:t xml:space="preserve"> </w:t>
+      </w:r>
+      <w:r>
+        <w:rPr>
+          <w:rStyle w:val="VerbatimChar"/>
+        </w:rPr>
+        <w:t xml:space="preserve">.txt</w:t>
+      </w:r>
+      <w:r>
+        <w:t xml:space="preserve">); as Figuras 9 e 10 são capturas</w:t>
+      </w:r>
+      <w:r>
+        <w:t xml:space="preserve"> </w:t>
+      </w:r>
+      <w:r>
+        <w:t xml:space="preserve">diretas do navegador. Todas podem ser substituídas por</w:t>
+      </w:r>
+      <w:r>
+        <w:t xml:space="preserve"> </w:t>
+      </w:r>
+      <w:r>
+        <w:rPr>
+          <w:i/>
+          <w:iCs/>
+        </w:rPr>
+        <w:t xml:space="preserve">screenshots</w:t>
+      </w:r>
+      <w:r>
+        <w:t xml:space="preserve"> </w:t>
+      </w:r>
+      <w:r>
+        <w:t xml:space="preserve">próprios</w:t>
+      </w:r>
+      <w:r>
+        <w:t xml:space="preserve"> </w:t>
+      </w:r>
+      <w:r>
+        <w:t xml:space="preserve">tirados durante a demonstração, se preferir.</w:t>
+      </w:r>
+    </w:p>
+    <w:bookmarkEnd w:id="51"/>
+    <w:bookmarkEnd w:id="52"/>
+    <w:bookmarkStart w:id="53" w:name="demonstração-ciclo-devsecops"/>
+    <w:p>
+      <w:pPr>
+        <w:pStyle w:val="Heading1"/>
+      </w:pPr>
+      <w:r>
+        <w:t xml:space="preserve">10. Demonstração (ciclo DevSecOps)</w:t>
+      </w:r>
+    </w:p>
+    <w:p>
+      <w:pPr>
+        <w:pStyle w:val="FirstParagraph"/>
+      </w:pPr>
+      <w:r>
+        <w:t xml:space="preserve">Na demonstração em sala é feita uma</w:t>
+      </w:r>
+      <w:r>
+        <w:t xml:space="preserve"> </w:t>
+      </w:r>
       <w:r>
         <w:rPr>
           <w:b/>
           <w:bCs/>
         </w:rPr>
-        <w:t xml:space="preserve">Prints:</w:t>
-      </w:r>
-      <w:r>
-        <w:t xml:space="preserve"> </w:t>
-      </w:r>
-      <w:r>
-        <w:t xml:space="preserve">inserir aqui as capturas de tela do WSL de cada etapa</w:t>
-      </w:r>
-      <w:r>
-        <w:t xml:space="preserve"> </w:t>
-      </w:r>
-      <w:r>
-        <w:t xml:space="preserve">(pipeline iniciando, build, testes, security scan, imagem Docker, container</w:t>
-      </w:r>
-      <w:r>
-        <w:t xml:space="preserve"> </w:t>
-      </w:r>
-      <w:r>
-        <w:t xml:space="preserve">em execução e aplicação funcionando no navegador).</w:t>
+        <w:t xml:space="preserve">alteração simples no código</w:t>
+      </w:r>
+      <w:r>
+        <w:t xml:space="preserve"> </w:t>
+      </w:r>
+      <w:r>
+        <w:t xml:space="preserve">(script</w:t>
+      </w:r>
+      <w:r>
+        <w:t xml:space="preserve"> </w:t>
+      </w:r>
+      <w:r>
+        <w:rPr>
+          <w:rStyle w:val="VerbatimChar"/>
+        </w:rPr>
+        <w:t xml:space="preserve">scripts/demo-fix.sh</w:t>
+      </w:r>
+      <w:r>
+        <w:t xml:space="preserve">) que corrige as dependências vulneráveis e incrementa a</w:t>
+      </w:r>
+      <w:r>
+        <w:t xml:space="preserve"> </w:t>
+      </w:r>
+      <w:r>
+        <w:t xml:space="preserve">versão para</w:t>
+      </w:r>
+      <w:r>
+        <w:t xml:space="preserve"> </w:t>
+      </w:r>
+      <w:r>
+        <w:rPr>
+          <w:rStyle w:val="VerbatimChar"/>
+        </w:rPr>
+        <w:t xml:space="preserve">1.0.1</w:t>
+      </w:r>
+      <w:r>
+        <w:t xml:space="preserve">:</w:t>
+      </w:r>
+    </w:p>
+    <w:p>
+      <w:pPr>
+        <w:pStyle w:val="SourceCode"/>
+      </w:pPr>
+      <w:r>
+        <w:rPr>
+          <w:rStyle w:val="StringTok"/>
+        </w:rPr>
+        <w:t xml:space="preserve">- requests==2.28.1</w:t>
+      </w:r>
+      <w:r>
+        <w:br/>
+      </w:r>
+      <w:r>
+        <w:rPr>
+          <w:rStyle w:val="StringTok"/>
+        </w:rPr>
+        <w:t xml:space="preserve">- urllib3==1.26.12</w:t>
+      </w:r>
+      <w:r>
+        <w:br/>
+      </w:r>
+      <w:r>
+        <w:rPr>
+          <w:rStyle w:val="StringTok"/>
+        </w:rPr>
+        <w:t xml:space="preserve">- certifi==2022.9.24</w:t>
+      </w:r>
+      <w:r>
+        <w:br/>
+      </w:r>
+      <w:r>
+        <w:rPr>
+          <w:rStyle w:val="VariableTok"/>
+        </w:rPr>
+        <w:t xml:space="preserve">+ requests==2.32.4</w:t>
+      </w:r>
+      <w:r>
+        <w:br/>
+      </w:r>
+      <w:r>
+        <w:rPr>
+          <w:rStyle w:val="VariableTok"/>
+        </w:rPr>
+        <w:t xml:space="preserve">+ urllib3==2.2.2</w:t>
+      </w:r>
+      <w:r>
+        <w:br/>
+      </w:r>
+      <w:r>
+        <w:rPr>
+          <w:rStyle w:val="VariableTok"/>
+        </w:rPr>
+        <w:t xml:space="preserve">+ certifi==2024.8.30</w:t>
       </w:r>
     </w:p>
     <w:p>
       <w:pPr>
         <w:pStyle w:val="FirstParagraph"/>
       </w:pPr>
+      <w:r>
+        <w:t xml:space="preserve">Após</w:t>
+      </w:r>
+      <w:r>
+        <w:t xml:space="preserve"> </w:t>
+      </w:r>
+      <w:r>
+        <w:rPr>
+          <w:rStyle w:val="VerbatimChar"/>
+        </w:rPr>
+        <w:t xml:space="preserve">commit</w:t>
+      </w:r>
+      <w:r>
+        <w:t xml:space="preserve"> </w:t>
+      </w:r>
+      <w:r>
+        <w:t xml:space="preserve">+</w:t>
+      </w:r>
+      <w:r>
+        <w:t xml:space="preserve"> </w:t>
+      </w:r>
+      <w:r>
+        <w:rPr>
+          <w:rStyle w:val="VerbatimChar"/>
+        </w:rPr>
+        <w:t xml:space="preserve">push</w:t>
+      </w:r>
+      <w:r>
+        <w:t xml:space="preserve">, a pipeline roda automaticamente e os achados de</w:t>
+      </w:r>
+      <w:r>
+        <w:t xml:space="preserve"> </w:t>
+      </w:r>
+      <w:r>
+        <w:rPr>
+          <w:rStyle w:val="VerbatimChar"/>
+        </w:rPr>
+        <w:t xml:space="preserve">urllib3</w:t>
+      </w:r>
+      <w:r>
+        <w:t xml:space="preserve">/</w:t>
+      </w:r>
+      <w:r>
+        <w:rPr>
+          <w:rStyle w:val="VerbatimChar"/>
+        </w:rPr>
+        <w:t xml:space="preserve">certifi</w:t>
+      </w:r>
+      <w:r>
+        <w:t xml:space="preserve">/</w:t>
+      </w:r>
+      <w:r>
+        <w:rPr>
+          <w:rStyle w:val="VerbatimChar"/>
+        </w:rPr>
+        <w:t xml:space="preserve">requests</w:t>
+      </w:r>
+      <w:r>
+        <w:t xml:space="preserve"> </w:t>
+      </w:r>
       <w:r>
         <w:rPr>
           <w:b/>
           <w:bCs/>
         </w:rPr>
-        <w:t xml:space="preserve">Comprovação da aplicação em execução (saída real):</w:t>
-      </w:r>
-    </w:p>
-    <w:p>
-      <w:pPr>
-        <w:pStyle w:val="SourceCode"/>
-      </w:pPr>
-      <w:r>
-        <w:rPr>
-          <w:rStyle w:val="VerbatimChar"/>
-        </w:rPr>
-        <w:t xml:space="preserve">$ docker ps --filter name=techsecure-app</w:t>
-      </w:r>
-      <w:r>
-        <w:br/>
-      </w:r>
-      <w:r>
-        <w:rPr>
-          <w:rStyle w:val="VerbatimChar"/>
-        </w:rPr>
-        <w:t xml:space="preserve">NAMES            STATUS                        PORTS</w:t>
-      </w:r>
-      <w:r>
-        <w:br/>
-      </w:r>
-      <w:r>
-        <w:rPr>
-          <w:rStyle w:val="VerbatimChar"/>
-        </w:rPr>
-        <w:t xml:space="preserve">techsecure-app   Up About a minute (healthy)   0.0.0.0:8080-&gt;8080/tcp</w:t>
-      </w:r>
-      <w:r>
-        <w:br/>
-      </w:r>
-      <w:r>
-        <w:br/>
-      </w:r>
-      <w:r>
-        <w:rPr>
-          <w:rStyle w:val="VerbatimChar"/>
-        </w:rPr>
-        <w:t xml:space="preserve">$ curl http://localhost:8080/health</w:t>
-      </w:r>
-      <w:r>
-        <w:br/>
-      </w:r>
-      <w:r>
-        <w:rPr>
-          <w:rStyle w:val="VerbatimChar"/>
-        </w:rPr>
-        <w:t xml:space="preserve">{"status":"ok","version":"1.0.0"}</w:t>
-      </w:r>
-      <w:r>
-        <w:br/>
-      </w:r>
-      <w:r>
-        <w:br/>
-      </w:r>
-      <w:r>
-        <w:rPr>
-          <w:rStyle w:val="VerbatimChar"/>
-        </w:rPr>
-        <w:t xml:space="preserve">$ curl http://localhost:8080/api/version</w:t>
-      </w:r>
-      <w:r>
-        <w:br/>
-      </w:r>
-      <w:r>
-        <w:rPr>
-          <w:rStyle w:val="VerbatimChar"/>
-        </w:rPr>
-        <w:t xml:space="preserve">{"app":"TechSecure Solutions","requests_lib":"2.28.1","version":"1.0.0"}</w:t>
-      </w:r>
-    </w:p>
-    <w:bookmarkEnd w:id="21"/>
-    <w:bookmarkStart w:id="22" w:name="demonstração-ciclo-devsecops"/>
-    <w:p>
-      <w:pPr>
-        <w:pStyle w:val="Heading1"/>
-      </w:pPr>
-      <w:r>
-        <w:t xml:space="preserve">10. Demonstração (ciclo DevSecOps)</w:t>
-      </w:r>
-    </w:p>
-    <w:p>
-      <w:pPr>
-        <w:pStyle w:val="FirstParagraph"/>
-      </w:pPr>
-      <w:r>
-        <w:t xml:space="preserve">Na demonstração em sala é feita uma</w:t>
+        <w:t xml:space="preserve">desaparecem</w:t>
+      </w:r>
+      <w:r>
+        <w:t xml:space="preserve"> </w:t>
+      </w:r>
+      <w:r>
+        <w:t xml:space="preserve">do relatório de segurança,</w:t>
+      </w:r>
+      <w:r>
+        <w:t xml:space="preserve"> </w:t>
+      </w:r>
+      <w:r>
+        <w:t xml:space="preserve">comprovando o ciclo</w:t>
       </w:r>
       <w:r>
         <w:t xml:space="preserve"> </w:t>
@@ -4234,192 +4969,6 @@
           <w:b/>
           <w:bCs/>
         </w:rPr>
-        <w:t xml:space="preserve">alteração simples no código</w:t>
-      </w:r>
-      <w:r>
-        <w:t xml:space="preserve"> </w:t>
-      </w:r>
-      <w:r>
-        <w:t xml:space="preserve">(script</w:t>
-      </w:r>
-      <w:r>
-        <w:t xml:space="preserve"> </w:t>
-      </w:r>
-      <w:r>
-        <w:rPr>
-          <w:rStyle w:val="VerbatimChar"/>
-        </w:rPr>
-        <w:t xml:space="preserve">scripts/demo-fix.sh</w:t>
-      </w:r>
-      <w:r>
-        <w:t xml:space="preserve">) que corrige as dependências vulneráveis e incrementa a</w:t>
-      </w:r>
-      <w:r>
-        <w:t xml:space="preserve"> </w:t>
-      </w:r>
-      <w:r>
-        <w:t xml:space="preserve">versão para</w:t>
-      </w:r>
-      <w:r>
-        <w:t xml:space="preserve"> </w:t>
-      </w:r>
-      <w:r>
-        <w:rPr>
-          <w:rStyle w:val="VerbatimChar"/>
-        </w:rPr>
-        <w:t xml:space="preserve">1.0.1</w:t>
-      </w:r>
-      <w:r>
-        <w:t xml:space="preserve">:</w:t>
-      </w:r>
-    </w:p>
-    <w:p>
-      <w:pPr>
-        <w:pStyle w:val="SourceCode"/>
-      </w:pPr>
-      <w:r>
-        <w:rPr>
-          <w:rStyle w:val="StringTok"/>
-        </w:rPr>
-        <w:t xml:space="preserve">- requests==2.28.1</w:t>
-      </w:r>
-      <w:r>
-        <w:br/>
-      </w:r>
-      <w:r>
-        <w:rPr>
-          <w:rStyle w:val="StringTok"/>
-        </w:rPr>
-        <w:t xml:space="preserve">- urllib3==1.26.12</w:t>
-      </w:r>
-      <w:r>
-        <w:br/>
-      </w:r>
-      <w:r>
-        <w:rPr>
-          <w:rStyle w:val="StringTok"/>
-        </w:rPr>
-        <w:t xml:space="preserve">- certifi==2022.9.24</w:t>
-      </w:r>
-      <w:r>
-        <w:br/>
-      </w:r>
-      <w:r>
-        <w:rPr>
-          <w:rStyle w:val="VariableTok"/>
-        </w:rPr>
-        <w:t xml:space="preserve">+ requests==2.32.4</w:t>
-      </w:r>
-      <w:r>
-        <w:br/>
-      </w:r>
-      <w:r>
-        <w:rPr>
-          <w:rStyle w:val="VariableTok"/>
-        </w:rPr>
-        <w:t xml:space="preserve">+ urllib3==2.2.2</w:t>
-      </w:r>
-      <w:r>
-        <w:br/>
-      </w:r>
-      <w:r>
-        <w:rPr>
-          <w:rStyle w:val="VariableTok"/>
-        </w:rPr>
-        <w:t xml:space="preserve">+ certifi==2024.8.30</w:t>
-      </w:r>
-    </w:p>
-    <w:p>
-      <w:pPr>
-        <w:pStyle w:val="FirstParagraph"/>
-      </w:pPr>
-      <w:r>
-        <w:t xml:space="preserve">Após</w:t>
-      </w:r>
-      <w:r>
-        <w:t xml:space="preserve"> </w:t>
-      </w:r>
-      <w:r>
-        <w:rPr>
-          <w:rStyle w:val="VerbatimChar"/>
-        </w:rPr>
-        <w:t xml:space="preserve">commit</w:t>
-      </w:r>
-      <w:r>
-        <w:t xml:space="preserve"> </w:t>
-      </w:r>
-      <w:r>
-        <w:t xml:space="preserve">+</w:t>
-      </w:r>
-      <w:r>
-        <w:t xml:space="preserve"> </w:t>
-      </w:r>
-      <w:r>
-        <w:rPr>
-          <w:rStyle w:val="VerbatimChar"/>
-        </w:rPr>
-        <w:t xml:space="preserve">push</w:t>
-      </w:r>
-      <w:r>
-        <w:t xml:space="preserve">, a pipeline roda automaticamente e os achados de</w:t>
-      </w:r>
-      <w:r>
-        <w:t xml:space="preserve"> </w:t>
-      </w:r>
-      <w:r>
-        <w:rPr>
-          <w:rStyle w:val="VerbatimChar"/>
-        </w:rPr>
-        <w:t xml:space="preserve">urllib3</w:t>
-      </w:r>
-      <w:r>
-        <w:t xml:space="preserve">/</w:t>
-      </w:r>
-      <w:r>
-        <w:rPr>
-          <w:rStyle w:val="VerbatimChar"/>
-        </w:rPr>
-        <w:t xml:space="preserve">certifi</w:t>
-      </w:r>
-      <w:r>
-        <w:t xml:space="preserve">/</w:t>
-      </w:r>
-      <w:r>
-        <w:rPr>
-          <w:rStyle w:val="VerbatimChar"/>
-        </w:rPr>
-        <w:t xml:space="preserve">requests</w:t>
-      </w:r>
-      <w:r>
-        <w:t xml:space="preserve"> </w:t>
-      </w:r>
-      <w:r>
-        <w:rPr>
-          <w:b/>
-          <w:bCs/>
-        </w:rPr>
-        <w:t xml:space="preserve">desaparecem</w:t>
-      </w:r>
-      <w:r>
-        <w:t xml:space="preserve"> </w:t>
-      </w:r>
-      <w:r>
-        <w:t xml:space="preserve">do relatório de segurança,</w:t>
-      </w:r>
-      <w:r>
-        <w:t xml:space="preserve"> </w:t>
-      </w:r>
-      <w:r>
-        <w:t xml:space="preserve">comprovando o ciclo</w:t>
-      </w:r>
-      <w:r>
-        <w:t xml:space="preserve"> </w:t>
-      </w:r>
-      <w:r>
-        <w:rPr>
-          <w:b/>
-          <w:bCs/>
-        </w:rPr>
         <w:t xml:space="preserve">detecção → correção → verificação</w:t>
       </w:r>
       <w:r>
@@ -4429,8 +4978,8 @@
         <w:t xml:space="preserve">automatizado.</w:t>
       </w:r>
     </w:p>
-    <w:bookmarkEnd w:id="22"/>
-    <w:bookmarkStart w:id="23" w:name="dificuldades-encontradas"/>
+    <w:bookmarkEnd w:id="53"/>
+    <w:bookmarkStart w:id="54" w:name="dificuldades-encontradas"/>
     <w:p>
       <w:pPr>
         <w:pStyle w:val="Heading1"/>
@@ -4581,8 +5130,8 @@
         <w:t xml:space="preserve">correção clara, as dependências foram fixadas em versões com CVEs conhecidos.</w:t>
       </w:r>
     </w:p>
-    <w:bookmarkEnd w:id="23"/>
-    <w:bookmarkStart w:id="24" w:name="conclusão"/>
+    <w:bookmarkEnd w:id="54"/>
+    <w:bookmarkStart w:id="55" w:name="conclusão"/>
     <w:p>
       <w:pPr>
         <w:pStyle w:val="Heading1"/>
@@ -4675,8 +5224,8 @@
         <w:t xml:space="preserve">objetivo da TechSecure Solutions.</w:t>
       </w:r>
     </w:p>
-    <w:bookmarkEnd w:id="24"/>
-    <w:bookmarkStart w:id="25" w:name="apêndice-estrutura-do-repositório"/>
+    <w:bookmarkEnd w:id="55"/>
+    <w:bookmarkStart w:id="56" w:name="apêndice-estrutura-do-repositório"/>
     <w:p>
       <w:pPr>
         <w:pStyle w:val="Heading1"/>
@@ -4867,7 +5416,7 @@
         <w:t xml:space="preserve">└── README.md</w:t>
       </w:r>
     </w:p>
-    <w:bookmarkEnd w:id="25"/>
+    <w:bookmarkEnd w:id="56"/>
     <w:sectPr>
       <w:footnotePr>
         <w:numRestart w:val="eachSect"/>

</xml_diff>

<commit_message>
feat: slides (.pptx) + prints com visual do terminal Ubuntu
- evidencias/img: prints regerados com aparencia do GNOME Terminal (Ubuntu/Yaru)
- docs/apresentacao.pptx: deck de 11 slides (gerado com pptxgenjs)
- scripts/gerar-slides.js
- trabalho-escrito.docx regenerado com os novos prints

Co-Authored-By: Claude Opus 4.8 <noreply@anthropic.com>
</commit_message>
<xml_diff>
--- a/docs/trabalho-escrito.docx
+++ b/docs/trabalho-escrito.docx
@@ -4132,7 +4132,7 @@
       <w:r>
         <w:drawing>
           <wp:inline>
-            <wp:extent cx="5334000" cy="3112057"/>
+            <wp:extent cx="5334000" cy="3289632"/>
             <wp:effectExtent b="0" l="0" r="0" t="0"/>
             <wp:docPr descr="Figura 1 — Testes automatizados (pytest): 6 testes aprovados." title="" id="22" name="Picture"/>
             <a:graphic>
@@ -4153,7 +4153,7 @@
                   <pic:spPr bwMode="auto">
                     <a:xfrm>
                       <a:off x="0" y="0"/>
-                      <a:ext cx="5334000" cy="3112057"/>
+                      <a:ext cx="5334000" cy="3289632"/>
                     </a:xfrm>
                     <a:prstGeom prst="rect">
                       <a:avLst/>
@@ -4187,7 +4187,7 @@
       <w:r>
         <w:drawing>
           <wp:inline>
-            <wp:extent cx="5334000" cy="4223703"/>
+            <wp:extent cx="5334000" cy="4445000"/>
             <wp:effectExtent b="0" l="0" r="0" t="0"/>
             <wp:docPr descr="Figura 2 — Security scan com Bandit (SAST): achado B104 no código." title="" id="25" name="Picture"/>
             <a:graphic>
@@ -4208,7 +4208,7 @@
                   <pic:spPr bwMode="auto">
                     <a:xfrm>
                       <a:off x="0" y="0"/>
-                      <a:ext cx="5334000" cy="4223703"/>
+                      <a:ext cx="5334000" cy="4445000"/>
                     </a:xfrm>
                     <a:prstGeom prst="rect">
                       <a:avLst/>
@@ -4242,7 +4242,7 @@
       <w:r>
         <w:drawing>
           <wp:inline>
-            <wp:extent cx="5334000" cy="6777317"/>
+            <wp:extent cx="5334000" cy="6212781"/>
             <wp:effectExtent b="0" l="0" r="0" t="0"/>
             <wp:docPr descr="Figura 3 — Security scan com pip-audit: CVEs nas dependências." title="" id="28" name="Picture"/>
             <a:graphic>
@@ -4263,7 +4263,7 @@
                   <pic:spPr bwMode="auto">
                     <a:xfrm>
                       <a:off x="0" y="0"/>
-                      <a:ext cx="5334000" cy="6777317"/>
+                      <a:ext cx="5334000" cy="6212781"/>
                     </a:xfrm>
                     <a:prstGeom prst="rect">
                       <a:avLst/>
@@ -4297,7 +4297,7 @@
       <w:r>
         <w:drawing>
           <wp:inline>
-            <wp:extent cx="5334000" cy="3649164"/>
+            <wp:extent cx="5334000" cy="3838596"/>
             <wp:effectExtent b="0" l="0" r="0" t="0"/>
             <wp:docPr descr="Figura 4 — Security scan com Trivy (filesystem): 8 vulnerabilidades HIGH." title="" id="31" name="Picture"/>
             <a:graphic>
@@ -4318,7 +4318,7 @@
                   <pic:spPr bwMode="auto">
                     <a:xfrm>
                       <a:off x="0" y="0"/>
-                      <a:ext cx="5334000" cy="3649164"/>
+                      <a:ext cx="5334000" cy="3838596"/>
                     </a:xfrm>
                     <a:prstGeom prst="rect">
                       <a:avLst/>
@@ -4352,7 +4352,7 @@
       <w:r>
         <w:drawing>
           <wp:inline>
-            <wp:extent cx="5334000" cy="2690601"/>
+            <wp:extent cx="5334000" cy="2841037"/>
             <wp:effectExtent b="0" l="0" r="0" t="0"/>
             <wp:docPr descr="Figura 5 — Build da imagem Docker da aplicação." title="" id="34" name="Picture"/>
             <a:graphic>
@@ -4373,7 +4373,7 @@
                   <pic:spPr bwMode="auto">
                     <a:xfrm>
                       <a:off x="0" y="0"/>
-                      <a:ext cx="5334000" cy="2690601"/>
+                      <a:ext cx="5334000" cy="2841037"/>
                     </a:xfrm>
                     <a:prstGeom prst="rect">
                       <a:avLst/>
@@ -4407,7 +4407,7 @@
       <w:r>
         <w:drawing>
           <wp:inline>
-            <wp:extent cx="5334000" cy="3010506"/>
+            <wp:extent cx="5334000" cy="3171151"/>
             <wp:effectExtent b="0" l="0" r="0" t="0"/>
             <wp:docPr descr="Figura 6 — Scan da imagem Docker com Trivy (pacotes Python + SO)." title="" id="37" name="Picture"/>
             <a:graphic>
@@ -4428,7 +4428,7 @@
                   <pic:spPr bwMode="auto">
                     <a:xfrm>
                       <a:off x="0" y="0"/>
-                      <a:ext cx="5334000" cy="3010506"/>
+                      <a:ext cx="5334000" cy="3171151"/>
                     </a:xfrm>
                     <a:prstGeom prst="rect">
                       <a:avLst/>
@@ -4462,7 +4462,7 @@
       <w:r>
         <w:drawing>
           <wp:inline>
-            <wp:extent cx="5334000" cy="950237"/>
+            <wp:extent cx="5334000" cy="1034014"/>
             <wp:effectExtent b="0" l="0" r="0" t="0"/>
             <wp:docPr descr="Figura 7 — Container em execução (status healthy) na porta 8080." title="" id="40" name="Picture"/>
             <a:graphic>
@@ -4483,7 +4483,7 @@
                   <pic:spPr bwMode="auto">
                     <a:xfrm>
                       <a:off x="0" y="0"/>
-                      <a:ext cx="5334000" cy="950237"/>
+                      <a:ext cx="5334000" cy="1034014"/>
                     </a:xfrm>
                     <a:prstGeom prst="rect">
                       <a:avLst/>
@@ -4530,7 +4530,7 @@
       <w:r>
         <w:drawing>
           <wp:inline>
-            <wp:extent cx="5334000" cy="2164976"/>
+            <wp:extent cx="5334000" cy="1993515"/>
             <wp:effectExtent b="0" l="0" r="0" t="0"/>
             <wp:docPr descr="Figura 8 — Aplicação respondendo aos endpoints (curl)." title="" id="43" name="Picture"/>
             <a:graphic>
@@ -4551,7 +4551,7 @@
                   <pic:spPr bwMode="auto">
                     <a:xfrm>
                       <a:off x="0" y="0"/>
-                      <a:ext cx="5334000" cy="2164976"/>
+                      <a:ext cx="5334000" cy="1993515"/>
                     </a:xfrm>
                     <a:prstGeom prst="rect">
                       <a:avLst/>

</xml_diff>